<commit_message>
[Documentation] Revise HW1/HW2 submission documents
- Condense Problem Statement from 5 paragraphs to 1 (~280 chars)
- Rename system feature IDs from SF-XX to FEA-XX in section 2.3
- Replace specific error messages with generic terms in UC extensions
- Remove CLI command details from all Use Cases in section 2.5
- Remove obsolete PDF exports
</commit_message>
<xml_diff>
--- a/hw/hw1/113598009_1.docx
+++ b/hw/hw1/113598009_1.docx
@@ -189,40 +189,7 @@
           <w:sz w:val="40"/>
           <w:szCs w:val="40"/>
         </w:rPr>
-        <w:t xml:space="preserve">113598009 </w:t>
-      </w:r>
-      <w:r>
-        <w:rPr>
-          <w:rFonts w:ascii="Times New Roman" w:eastAsia="標楷體" w:hAnsi="Times New Roman" w:cs="新細明體" w:hint="eastAsia"/>
-          <w:b/>
-          <w:bCs/>
-          <w:color w:val="000000" w:themeColor="text1"/>
-          <w:sz w:val="40"/>
-          <w:szCs w:val="40"/>
-        </w:rPr>
-        <w:t>資工碩二</w:t>
-      </w:r>
-      <w:r>
-        <w:rPr>
-          <w:rFonts w:ascii="Times New Roman" w:eastAsia="標楷體" w:hAnsi="Times New Roman" w:cs="新細明體" w:hint="eastAsia"/>
-          <w:b/>
-          <w:bCs/>
-          <w:color w:val="000000" w:themeColor="text1"/>
-          <w:sz w:val="40"/>
-          <w:szCs w:val="40"/>
-        </w:rPr>
-        <w:t xml:space="preserve"> </w:t>
-      </w:r>
-      <w:r>
-        <w:rPr>
-          <w:rFonts w:ascii="Times New Roman" w:eastAsia="標楷體" w:hAnsi="Times New Roman" w:cs="新細明體" w:hint="eastAsia"/>
-          <w:b/>
-          <w:bCs/>
-          <w:color w:val="000000" w:themeColor="text1"/>
-          <w:sz w:val="40"/>
-          <w:szCs w:val="40"/>
-        </w:rPr>
-        <w:t>李俊威</w:t>
+        <w:t>113598009 資工碩二 李俊威</w:t>
       </w:r>
     </w:p>
     <w:p>
@@ -263,7 +230,7 @@
     </w:p>
     <w:p>
       <w:pPr>
-        <w:spacing w:after="200"/>
+        <w:spacing w:after="240"/>
         <w:ind w:firstLine="480"/>
         <w:rPr>
           <w:rFonts w:ascii="Times New Roman" w:eastAsia="標楷體" w:hAnsi="Times New Roman"/>
@@ -273,249 +240,36 @@
         <w:rPr>
           <w:rFonts w:ascii="Times New Roman" w:eastAsia="標楷體" w:hAnsi="Times New Roman"/>
         </w:rPr>
-        <w:t>隨著軟體系統規模不斷擴大，維護一致的架構風格成為開發團隊面臨的核心挑戰之一。架構風格是一組規範類別之間職責分配、依賴方向與互動方式的結構性約束，開發團隊通常會在專案初期選定特定的架構風格，作為整個程式碼庫的設計準則。然而，隨著程式碼持續增長，確認實際產出的程式碼是否真正符合預期的架構風格，往往只能依賴人工逐一審查，這是一個費時、主觀且難以規模化的過程。</w:t>
-      </w:r>
-    </w:p>
-    <w:p>
-      <w:pPr>
-        <w:spacing w:after="200"/>
-        <w:ind w:firstLine="480"/>
-        <w:rPr>
-          <w:rFonts w:ascii="Times New Roman" w:eastAsia="標楷體" w:hAnsi="Times New Roman"/>
-        </w:rPr>
-      </w:pPr>
-      <w:r>
-        <w:rPr>
-          <w:rFonts w:ascii="Times New Roman" w:eastAsia="標楷體" w:hAnsi="Times New Roman"/>
-        </w:rPr>
-        <w:t>這個問題在導入</w:t>
-      </w:r>
-      <w:r>
-        <w:rPr>
-          <w:rFonts w:ascii="Times New Roman" w:eastAsia="標楷體" w:hAnsi="Times New Roman"/>
-        </w:rPr>
-        <w:t xml:space="preserve"> AI </w:t>
-      </w:r>
-      <w:r>
-        <w:rPr>
-          <w:rFonts w:ascii="Times New Roman" w:eastAsia="標楷體" w:hAnsi="Times New Roman"/>
-        </w:rPr>
-        <w:t>輔助程式碼生成的開發情境中尤為突出。當開發者使用大型語言模型生成程式碼時，產出物在功能上可能正確，但在結構上卻可能偏離預期的架構風格。若缺乏自動化的合規驗證工具，開發者只能在事後手動比對每個類別是否符合架構規範，</w:t>
-      </w:r>
-      <w:r>
-        <w:rPr>
-          <w:rFonts w:ascii="Times New Roman" w:eastAsia="標楷體" w:hAnsi="Times New Roman" w:hint="eastAsia"/>
-        </w:rPr>
-        <w:t>大量的人工驗證時間在開發週期上變成了</w:t>
-      </w:r>
-      <w:r>
-        <w:rPr>
-          <w:rFonts w:ascii="Times New Roman" w:eastAsia="標楷體" w:hAnsi="Times New Roman" w:hint="eastAsia"/>
+        <w:t>隨著軟體系統規模擴大與 AI 輔助程式碼生成的普及，人工驗證架構風格合規性日益困難，成為開發週期的瓶頸。現有工具（如 ArchUnit）雖可將架構限制寫成測試規則，但使用門檻較高，開發者需熟悉底層 API 並撰寫大量樣板程式碼，缺乏以風格為中心的高階抽象。arch-checker 是一套專為 Java 開發者設計的命令列工具，用於自動驗證 Java 專案的架構風格合規性。使用者可透過宣告式 API 以 YAML 定義架構風格設定檔（Style Profile），將命名、依賴、繼承等規則封裝為可重複使用的風格單元。系統透過 Java 原始碼的 AST 解析，精確偵測結構性違規，並產出含檔案路徑、行號與錯誤描述的完整報告，適用於本地開發、程式碼審查與持續整合情境。</w:t>
+      </w:r>
+    </w:p>
+    <w:p>
+      <w:pPr>
+        <w:pStyle w:val="1"/>
+        <w:spacing w:before="240" w:after="160"/>
+        <w:rPr>
+          <w:rFonts w:ascii="Times New Roman" w:eastAsia="標楷體" w:hAnsi="Times New Roman"/>
+        </w:rPr>
+      </w:pPr>
+      <w:r>
+        <w:rPr>
+          <w:rFonts w:ascii="Times New Roman" w:eastAsia="標楷體" w:hAnsi="Times New Roman"/>
+        </w:rPr>
+        <w:t>2.  Development Language</w:t>
+      </w:r>
+    </w:p>
+    <w:p>
+      <w:pPr>
+        <w:spacing w:after="240"/>
+        <w:rPr>
+          <w:rFonts w:ascii="Times New Roman" w:eastAsia="標楷體" w:hAnsi="Times New Roman"/>
+        </w:rPr>
+      </w:pPr>
+      <w:r>
+        <w:rPr>
+          <w:rFonts w:ascii="Times New Roman" w:eastAsia="標楷體" w:hAnsi="Times New Roman"/>
           <w:b/>
           <w:bCs/>
-          <w:color w:val="EE0000"/>
-        </w:rPr>
-        <w:t>Bottleneck</w:t>
-      </w:r>
-      <w:r>
-        <w:rPr>
-          <w:rFonts w:ascii="Times New Roman" w:eastAsia="標楷體" w:hAnsi="Times New Roman"/>
-        </w:rPr>
-        <w:t>。</w:t>
-      </w:r>
-    </w:p>
-    <w:p>
-      <w:pPr>
-        <w:spacing w:after="200"/>
-        <w:ind w:firstLine="480"/>
-        <w:rPr>
-          <w:rFonts w:ascii="Times New Roman" w:eastAsia="標楷體" w:hAnsi="Times New Roman"/>
-        </w:rPr>
-      </w:pPr>
-      <w:r>
-        <w:rPr>
-          <w:rFonts w:ascii="Times New Roman" w:eastAsia="標楷體" w:hAnsi="Times New Roman"/>
-        </w:rPr>
-        <w:t>現有工具（如</w:t>
-      </w:r>
-      <w:r>
-        <w:rPr>
-          <w:rFonts w:ascii="Times New Roman" w:eastAsia="標楷體" w:hAnsi="Times New Roman"/>
-        </w:rPr>
-        <w:t xml:space="preserve"> ArchUnit</w:t>
-      </w:r>
-      <w:r>
-        <w:rPr>
-          <w:rFonts w:ascii="Times New Roman" w:eastAsia="標楷體" w:hAnsi="Times New Roman"/>
-        </w:rPr>
-        <w:t>）雖然允許開發者將架構限制寫成測試規則，但使用門檻較高</w:t>
-      </w:r>
-      <w:r>
-        <w:rPr>
-          <w:rFonts w:ascii="Times New Roman" w:eastAsia="標楷體" w:hAnsi="Times New Roman"/>
-        </w:rPr>
-        <w:t>——</w:t>
-      </w:r>
-      <w:r>
-        <w:rPr>
-          <w:rFonts w:ascii="Times New Roman" w:eastAsia="標楷體" w:hAnsi="Times New Roman"/>
-        </w:rPr>
-        <w:t>開發者必須熟悉其底層</w:t>
-      </w:r>
-      <w:r>
-        <w:rPr>
-          <w:rFonts w:ascii="Times New Roman" w:eastAsia="標楷體" w:hAnsi="Times New Roman"/>
-        </w:rPr>
-        <w:t xml:space="preserve"> API</w:t>
-      </w:r>
-      <w:r>
-        <w:rPr>
-          <w:rFonts w:ascii="Times New Roman" w:eastAsia="標楷體" w:hAnsi="Times New Roman"/>
-        </w:rPr>
-        <w:t>，並為每一條規則撰寫繁瑣的樣板程式碼。目前市場上缺乏一種高階、以風格為中心的抽象工具，讓開發者能夠以簡潔的宣告方式定義「這個專案遵循某種架構風格」，並立即獲得具體、可操作的違規回饋。</w:t>
-      </w:r>
-    </w:p>
-    <w:p>
-      <w:pPr>
-        <w:spacing w:after="200"/>
-        <w:ind w:firstLine="480"/>
-        <w:rPr>
-          <w:rFonts w:ascii="Times New Roman" w:eastAsia="標楷體" w:hAnsi="Times New Roman"/>
-        </w:rPr>
-      </w:pPr>
-      <w:r>
-        <w:rPr>
-          <w:rFonts w:ascii="Times New Roman" w:eastAsia="標楷體" w:hAnsi="Times New Roman"/>
-        </w:rPr>
-        <w:t xml:space="preserve">arch-checker </w:t>
-      </w:r>
-      <w:r>
-        <w:rPr>
-          <w:rFonts w:ascii="Times New Roman" w:eastAsia="標楷體" w:hAnsi="Times New Roman"/>
-        </w:rPr>
-        <w:t>是一套專為</w:t>
-      </w:r>
-      <w:r>
-        <w:rPr>
-          <w:rFonts w:ascii="Times New Roman" w:eastAsia="標楷體" w:hAnsi="Times New Roman"/>
-        </w:rPr>
-        <w:t xml:space="preserve"> Java </w:t>
-      </w:r>
-      <w:r>
-        <w:rPr>
-          <w:rFonts w:ascii="Times New Roman" w:eastAsia="標楷體" w:hAnsi="Times New Roman"/>
-        </w:rPr>
-        <w:t>開發者、軟體架構師與研究人員設計的命令列工具，用於自動驗證</w:t>
-      </w:r>
-      <w:r>
-        <w:rPr>
-          <w:rFonts w:ascii="Times New Roman" w:eastAsia="標楷體" w:hAnsi="Times New Roman"/>
-        </w:rPr>
-        <w:t xml:space="preserve"> Java </w:t>
-      </w:r>
-      <w:r>
-        <w:rPr>
-          <w:rFonts w:ascii="Times New Roman" w:eastAsia="標楷體" w:hAnsi="Times New Roman"/>
-        </w:rPr>
-        <w:t>專案的架構風格合規性。使用者可透過流暢的宣告式</w:t>
-      </w:r>
-      <w:r>
-        <w:rPr>
-          <w:rFonts w:ascii="Times New Roman" w:eastAsia="標楷體" w:hAnsi="Times New Roman"/>
-        </w:rPr>
-        <w:t xml:space="preserve"> API </w:t>
-      </w:r>
-      <w:r>
-        <w:rPr>
-          <w:rFonts w:ascii="Times New Roman" w:eastAsia="標楷體" w:hAnsi="Times New Roman"/>
-        </w:rPr>
-        <w:t>定義架構風格設定檔（</w:t>
-      </w:r>
-      <w:r>
-        <w:rPr>
-          <w:rFonts w:ascii="Times New Roman" w:eastAsia="標楷體" w:hAnsi="Times New Roman"/>
-        </w:rPr>
-        <w:t>Style Profile</w:t>
-      </w:r>
-      <w:r>
-        <w:rPr>
-          <w:rFonts w:ascii="Times New Roman" w:eastAsia="標楷體" w:hAnsi="Times New Roman"/>
-        </w:rPr>
-        <w:t>），將一組命名規則封裝為可重複使用的風格單元。工具內建常見架構風格的規則集，同時支援使用者自行定義任意風格的規則。系統底層透過</w:t>
-      </w:r>
-      <w:r>
-        <w:rPr>
-          <w:rFonts w:ascii="Times New Roman" w:eastAsia="標楷體" w:hAnsi="Times New Roman"/>
-        </w:rPr>
-        <w:t xml:space="preserve"> Java </w:t>
-      </w:r>
-      <w:r>
-        <w:rPr>
-          <w:rFonts w:ascii="Times New Roman" w:eastAsia="標楷體" w:hAnsi="Times New Roman"/>
-        </w:rPr>
-        <w:t>原始碼的抽象語法樹（</w:t>
-      </w:r>
-      <w:r>
-        <w:rPr>
-          <w:rFonts w:ascii="Times New Roman" w:eastAsia="標楷體" w:hAnsi="Times New Roman"/>
-        </w:rPr>
-        <w:t>AST</w:t>
-      </w:r>
-      <w:r>
-        <w:rPr>
-          <w:rFonts w:ascii="Times New Roman" w:eastAsia="標楷體" w:hAnsi="Times New Roman"/>
-        </w:rPr>
-        <w:t>）解析，精確偵測結構性違規，並產出包含檔案路徑、行號與錯誤描述的完整報告。</w:t>
-      </w:r>
-    </w:p>
-    <w:p>
-      <w:pPr>
-        <w:spacing w:after="240"/>
-        <w:ind w:firstLine="480"/>
-        <w:rPr>
-          <w:rFonts w:ascii="Times New Roman" w:eastAsia="標楷體" w:hAnsi="Times New Roman"/>
-        </w:rPr>
-      </w:pPr>
-      <w:r>
-        <w:rPr>
-          <w:rFonts w:ascii="Times New Roman" w:eastAsia="標楷體" w:hAnsi="Times New Roman"/>
-        </w:rPr>
-        <w:t xml:space="preserve">arch-checker </w:t>
-      </w:r>
-      <w:r>
-        <w:rPr>
-          <w:rFonts w:ascii="Times New Roman" w:eastAsia="標楷體" w:hAnsi="Times New Roman"/>
-        </w:rPr>
-        <w:t>適用於本地開發、程式碼審查與持續整合三種情境，協助開發團隊在架構偏移發生的早期即時發現問題，降低後期重構的成本與風險。</w:t>
-      </w:r>
-    </w:p>
-    <w:p>
-      <w:pPr>
-        <w:pStyle w:val="1"/>
-        <w:spacing w:before="240" w:after="160"/>
-        <w:rPr>
-          <w:rFonts w:ascii="Times New Roman" w:eastAsia="標楷體" w:hAnsi="Times New Roman"/>
-        </w:rPr>
-      </w:pPr>
-      <w:r>
-        <w:rPr>
-          <w:rFonts w:ascii="Times New Roman" w:eastAsia="標楷體" w:hAnsi="Times New Roman"/>
-        </w:rPr>
-        <w:t>2.  Development Language</w:t>
-      </w:r>
-    </w:p>
-    <w:p>
-      <w:pPr>
-        <w:spacing w:after="240"/>
-        <w:rPr>
-          <w:rFonts w:ascii="Times New Roman" w:eastAsia="標楷體" w:hAnsi="Times New Roman"/>
-        </w:rPr>
-      </w:pPr>
-      <w:r>
-        <w:rPr>
-          <w:rFonts w:ascii="Times New Roman" w:eastAsia="標楷體" w:hAnsi="Times New Roman"/>
-          <w:b/>
-          <w:bCs/>
         </w:rPr>
         <w:t>Java</w:t>
       </w:r>
@@ -523,49 +277,7 @@
         <w:rPr>
           <w:rFonts w:ascii="Times New Roman" w:eastAsia="標楷體" w:hAnsi="Times New Roman"/>
         </w:rPr>
-        <w:t xml:space="preserve"> (JDK 17+)</w:t>
-      </w:r>
-      <w:r>
-        <w:rPr>
-          <w:rFonts w:ascii="Times New Roman" w:eastAsia="標楷體" w:hAnsi="Times New Roman"/>
-        </w:rPr>
-        <w:t>，使用</w:t>
-      </w:r>
-      <w:r>
-        <w:rPr>
-          <w:rFonts w:ascii="Times New Roman" w:eastAsia="標楷體" w:hAnsi="Times New Roman"/>
-        </w:rPr>
-        <w:t xml:space="preserve"> JavaParser </w:t>
-      </w:r>
-      <w:r>
-        <w:rPr>
-          <w:rFonts w:ascii="Times New Roman" w:eastAsia="標楷體" w:hAnsi="Times New Roman"/>
-        </w:rPr>
-        <w:t>進行</w:t>
-      </w:r>
-      <w:r>
-        <w:rPr>
-          <w:rFonts w:ascii="Times New Roman" w:eastAsia="標楷體" w:hAnsi="Times New Roman"/>
-        </w:rPr>
-        <w:t xml:space="preserve"> AST</w:t>
-      </w:r>
-      <w:r>
-        <w:rPr>
-          <w:rFonts w:ascii="Times New Roman" w:eastAsia="標楷體" w:hAnsi="Times New Roman"/>
-        </w:rPr>
-        <w:t>（</w:t>
-      </w:r>
-      <w:r>
-        <w:rPr>
-          <w:rFonts w:ascii="Times New Roman" w:eastAsia="標楷體" w:hAnsi="Times New Roman"/>
-        </w:rPr>
-        <w:t>Abstract Syntax Tree</w:t>
-      </w:r>
-      <w:r>
-        <w:rPr>
-          <w:rFonts w:ascii="Times New Roman" w:eastAsia="標楷體" w:hAnsi="Times New Roman"/>
-        </w:rPr>
-        <w:t>）分析。</w:t>
+        <w:t xml:space="preserve"> (JDK 17+)，使用 JavaParser 進行 AST（Abstract Syntax Tree）分析。</w:t>
       </w:r>
     </w:p>
     <w:p>
@@ -615,13 +327,7 @@
               <w:rPr>
                 <w:rFonts w:ascii="Times New Roman" w:eastAsia="標楷體" w:hAnsi="Times New Roman" w:hint="eastAsia"/>
               </w:rPr>
-              <w:t xml:space="preserve">113598009 </w:t>
-            </w:r>
-            <w:r>
-              <w:rPr>
-                <w:rFonts w:ascii="Times New Roman" w:eastAsia="標楷體" w:hAnsi="Times New Roman" w:hint="eastAsia"/>
-              </w:rPr>
-              <w:t>李俊威</w:t>
+              <w:t>113598009 李俊威</w:t>
             </w:r>
           </w:p>
         </w:tc>

</xml_diff>